<commit_message>
Update XBRL GL Next Taxonomy Framework Parts 1-3
</commit_message>
<xml_diff>
--- a/TaxonomyFramework/XBRL_GL_Next_Taxonomy_Framework_Part_2_Tuple_palette_taxonomy.docx
+++ b/TaxonomyFramework/XBRL_GL_Next_Taxonomy_Framework_Part_2_Tuple_palette_taxonomy.docx
@@ -5200,6 +5200,36 @@
     </w:p>
     <w:p>
       <w:pPr>
+        <w:pStyle w:val="Definition"/>
+      </w:pPr>
+      <w:r>
+        <w:t>`gen` taxonomy module</w:t>
+        <w:br/>
+        <w:t>the one shared generated taxonomy module containing binding-neutral reusable semantic definitions and used by both Tuple and OIM taxonomy assemblies.</w:t>
+      </w:r>
+    </w:p>
+    <w:p>
+      <w:pPr>
+        <w:pStyle w:val="Definition"/>
+      </w:pPr>
+      <w:r>
+        <w:t>Value Domain binding</w:t>
+        <w:br/>
+        <w:t>the explicit association of a semantic Attribute occurrence with a separately identified governed permitted value set and its approved XBRL realisation, independent of datatype binding.</w:t>
+      </w:r>
+    </w:p>
+    <w:p>
+      <w:pPr>
+        <w:pStyle w:val="Definition"/>
+      </w:pPr>
+      <w:r>
+        <w:t>legacy enumeration binding</w:t>
+        <w:br/>
+        <w:t>a Value Domain binding that preserves the identity and permitted members of an XBRL GL legacy controlled vocabulary for backward compatibility without silently replacing it with a standard vocabulary.</w:t>
+      </w:r>
+    </w:p>
+    <w:p>
+      <w:pPr>
         <w:pStyle w:val="1"/>
         <w:pageBreakBefore/>
       </w:pPr>
@@ -5229,47 +5259,7 @@
     </w:p>
     <w:p>
       <w:r>
-        <w:t xml:space="preserve">A </w:t>
-      </w:r>
-      <w:r>
-        <w:rPr>
-          <w:b/>
-          <w:bCs/>
-        </w:rPr>
-        <w:t>conformant taxonomy generator</w:t>
-      </w:r>
-      <w:r>
-        <w:t xml:space="preserve"> MUST accept the </w:t>
-      </w:r>
-      <w:r>
-        <w:rPr>
-          <w:b/>
-          <w:bCs/>
-        </w:rPr>
-        <w:t>LHM for taxonomy</w:t>
-      </w:r>
-      <w:r>
-        <w:t xml:space="preserve"> input set defined in Part 1. The set contains one or more formal 18-column </w:t>
-      </w:r>
-      <w:r>
-        <w:rPr>
-          <w:b/>
-          <w:bCs/>
-        </w:rPr>
-        <w:t>HMD_for_taxonomy</w:t>
-      </w:r>
-      <w:r>
-        <w:t xml:space="preserve"> CSV files. Each </w:t>
-      </w:r>
-      <w:r>
-        <w:rPr>
-          <w:b/>
-          <w:bCs/>
-        </w:rPr>
-        <w:t>formal HMD</w:t>
-      </w:r>
-      <w:r>
-        <w:t xml:space="preserve"> MUST be an unmodified output of Post-Graph Walk and is authoritative for the hierarchy, QNames, datatypes, multiplicities, labels, definitions, and occurrence order used by the Tuple binding.</w:t>
+        <w:t>A conformant taxonomy generator MUST accept the LHM for taxonomy input set defined in Part 1. The set contains one or more formal 18-column HMD_for_taxonomy CSV files. Each formal HMD MUST be an unmodified output of Post-Graph Walk and is authoritative for the hierarchy, QNames, semantic datatypes, multiplicities, labels, definitions, and occurrence order used by the Tuple binding. The XBRL item type is selected by the separate explicit datatype-binding operation in 5.3.</w:t>
       </w:r>
     </w:p>
     <w:p>
@@ -6228,7 +6218,7 @@
         <w:spacing w:after="80"/>
       </w:pPr>
       <w:r>
-        <w:t>The datatype value MUST be empty for C and R rows and supported for every A row.</w:t>
+        <w:t>The semantic datatype value MUST be empty for C and R rows. For every A row, an approved explicit override or default semantic-datatype mapping MUST resolve an XBRL item type; an unknown or `review-required` result is an error.</w:t>
       </w:r>
     </w:p>
     <w:p>
@@ -6632,6 +6622,32 @@
       <w:pPr>
         <w:pStyle w:val="2"/>
       </w:pPr>
+      <w:r>
+        <w:t>5.2.1 Class hierarchy and occurrence identity</w:t>
+      </w:r>
+    </w:p>
+    <w:p>
+      <w:pPr/>
+      <w:r>
+        <w:t>Tuple structure MUST remain faithful to every effective Class in the authoritative HMD hierarchy. A non-root Class with multiplicity `0..1` or `1..1` remains a Tuple and complexType in its semantic position even though Part 1 does not classify it as an occurrence-key Class.</w:t>
+      </w:r>
+    </w:p>
+    <w:p>
+      <w:pPr/>
+      <w:r>
+        <w:t>Occurrence-key classification is relevant to Structured CSV and the OIM dimensional realisation; it does not remove or flatten Tuple Classes. Tuple nesting itself represents structural occurrence and containment. In the hierarchy `Invoice / InvoiceLine [1..*] / ItemInformation [1..1] / ItemAttributes [0..*]`, all four Classes remain in the Tuple content model.</w:t>
+      </w:r>
+    </w:p>
+    <w:p>
+      <w:pPr/>
+      <w:r>
+        <w:t>For nested repeated Tuple Classes such as `Parent [0..*] / Child [0..*]`, each Child Tuple is physically nested in its Parent Tuple. This preserves parent-scoped Child occurrence identity without adding an OIM typed dimension to the Tuple content model.</w:t>
+      </w:r>
+    </w:p>
+    <w:p>
+      <w:pPr>
+        <w:pStyle w:val="2"/>
+      </w:pPr>
       <w:bookmarkStart w:id="57" w:name="_Toc237101067"/>
       <w:bookmarkStart w:id="58" w:name="_TocV11_20"/>
       <w:bookmarkStart w:id="59" w:name="_Toc237430363"/>
@@ -6644,7 +6660,7 @@
     </w:p>
     <w:p>
       <w:r>
-        <w:t>Every A row MUST be declared as an XBRL item with substitutionGroup xbrli:item, nillable=true, and xbrli:periodType=instant. The item type MUST be selected deterministically from datatype. A binding-specific named type in gl-gen MAY be used where the reviewed datatype identifies such a type; otherwise the corresponding XBRL item type MUST be used.</w:t>
+        <w:t>Every A row MUST be declared as an XBRL item with substitutionGroup xbrli:item, nillable=true, and xbrli:periodType=instant. Its HMD `datatype` remains a semantic representation term. The XBRL item type MUST be selected deterministically by applying an approved explicit occurrence or concept override first and the approved default semantic-datatype mapping second. If neither resolves the semantic datatype, or if the applicable result is `review-required`, generation MUST fail. The generator MUST NOT use a silent `xbrli:stringItemType` fallback or infer the type from `name`, `local_name`, a lexical value, or a suffix. An approved named type in the shared `gen` taxonomy module MAY be selected by that binding operation.</w:t>
       </w:r>
     </w:p>
     <w:tbl>
@@ -8113,6 +8129,50 @@
     </w:p>
     <w:p>
       <w:pPr>
+        <w:pStyle w:val="2"/>
+      </w:pPr>
+      <w:r>
+        <w:t>5.5 Shared `gen` module and Value Domain realisation</w:t>
+      </w:r>
+    </w:p>
+    <w:p>
+      <w:pPr/>
+      <w:r>
+        <w:t>The Tuple taxonomy assembly MUST use the same shared generated `gen` taxonomy module as the OIM assembly. The `gen` module contains binding-neutral reusable semantic definitions; Tuple content schemas, Tuple declarations, and Tuple hierarchy MUST remain in the Tuple modules and MUST NOT be introduced into `gen`.</w:t>
+      </w:r>
+    </w:p>
+    <w:p>
+      <w:pPr/>
+      <w:r>
+        <w:t>Datatype binding and Value Domain binding are separate operations. Datatype binding selects the XBRL item type without changing the HMD semantic datatype. Value Domain binding selects a separately identified governed permitted value set and MUST NOT be inferred from an Attribute name, `local_name`, lexical form, or datatype alone.</w:t>
+      </w:r>
+    </w:p>
+    <w:p>
+      <w:pPr/>
+      <w:r>
+        <w:t>Legacy, standard, and user-defined Value Domains MUST remain separately identifiable. XBRL GL 2003-compatible legacy Value Domains MUST remain available for backward compatibility and MUST NOT be silently replaced or translated to standard Value Domains. A user-defined Value Domain retains separate governance and identity even if some values match an external standard.</w:t>
+      </w:r>
+    </w:p>
+    <w:p>
+      <w:pPr/>
+      <w:r>
+        <w:t>A standard Value Domain MAY reference an authoritative external code list. Its authority, vocabulary identifier, edition or version, subset, provenance, and rights status belong to the Value Domain binding and taxonomy realisation. A crosswalk does not replace either Value Domain, and any crosswalk translation is an explicit transformation.</w:t>
+      </w:r>
+    </w:p>
+    <w:p>
+      <w:pPr/>
+      <w:r>
+        <w:t>Where an approved Value Domain binding requires an extensible enumeration, EE 1.0 is the intended taxonomy realisation mechanism so that one item fact reports one Value Domain member. Existing reusable or legacy enumeration content in `gen` remains distinct from future deterministic generation. Deterministic generation of EE 1.0 domain/member relationships and concept bindings from authoritative Value Domain definitions is NOT YET IMPLEMENTED in the current Taxonomy Generator.</w:t>
+      </w:r>
+    </w:p>
+    <w:p>
+      <w:pPr/>
+      <w:r>
+        <w:t>The formal HMD retains exactly the 18 columns in 4.2; no Value Domain or `domain_name` column is added. Pending formalisation, Value Domain binding MAY be supplied by a companion artefact keyed by a stable semantic-model identifier or `semantic_path`.</w:t>
+      </w:r>
+    </w:p>
+    <w:p>
+      <w:pPr>
         <w:pStyle w:val="1"/>
       </w:pPr>
       <w:bookmarkStart w:id="63" w:name="_Toc237101069"/>
@@ -15271,6 +15331,22 @@
       </w:r>
       <w:r>
         <w:t>, C/R-rooted reusable presentation forests, binding-specific Tuple/OIM presentation separation, final package naming, and informative Accounting Entries and Business Transactions Tuple instance examples.</w:t>
+      </w:r>
+    </w:p>
+    <w:p>
+      <w:pPr>
+        <w:pStyle w:val="aff6"/>
+      </w:pPr>
+      <w:r>
+        <w:t>20 August 2026 v15: Clarified semantic datatype versus XBRL item type binding; added the shared `gen` taxonomy module and Value Domain realisation; preserved distinct legacy, standard, and user-defined Value Domains; and stated the transitional implementation boundary.</w:t>
+      </w:r>
+    </w:p>
+    <w:p>
+      <w:pPr>
+        <w:pStyle w:val="aff6"/>
+      </w:pPr>
+      <w:r>
+        <w:t>21 August 2026 v16: Preserved all singular and repeated Classes in the Tuple content model while distinguishing occurrence-key classification as a Structured CSV/OIM concern; added parent-scoped nested-repeat guidance; and made the pending authoritative Value Domain-to-EE 1.0 generation boundary explicit.</w:t>
       </w:r>
     </w:p>
     <w:tbl>

</xml_diff>